<commit_message>
[ADD] Se agrego modulo de categorias y moviminetos toca ver desde el fronted
</commit_message>
<xml_diff>
--- a/VISION GENERAL.docx
+++ b/VISION GENERAL.docx
@@ -1205,57 +1205,25 @@
     </w:p>
     <w:p>
       <w:r>
-        <w:t>Monto</w:t>
-      </w:r>
-      <w:r>
-        <w:br/>
-      </w:r>
-      <w:r>
+        <w:t>Monto esperado</w:t>
+        <w:br/>
         <w:br/>
         <w:t>Cuenta destino</w:t>
-      </w:r>
-      <w:r>
-        <w:br/>
-      </w:r>
-      <w:r>
+        <w:br/>
         <w:br/>
         <w:t>Categoría</w:t>
-      </w:r>
-      <w:r>
-        <w:br/>
-      </w:r>
-      <w:r>
+        <w:br/>
         <w:br/>
         <w:t>Fecha</w:t>
-      </w:r>
-      <w:r>
-        <w:br/>
-      </w:r>
-      <w:r>
-        <w:lastRenderedPageBreak/>
+        <w:br/>
         <w:br/>
         <w:t>Hora</w:t>
-      </w:r>
-      <w:r>
-        <w:br/>
-      </w:r>
-      <w:r>
-        <w:br/>
-        <w:t>Estado</w:t>
-      </w:r>
-      <w:r>
-        <w:br/>
-      </w:r>
-      <w:r>
+        <w:br/>
         <w:br/>
         <w:t>Descripción</w:t>
-      </w:r>
-      <w:r>
-        <w:br/>
-      </w:r>
-      <w:r>
-        <w:br/>
-        <w:t>Recurrente</w:t>
+        <w:br/>
+        <w:br/>
+        <w:t>Recurrente (cuando exista el módulo)</w:t>
       </w:r>
     </w:p>
     <w:p>
@@ -1267,19 +1235,12 @@
     </w:p>
     <w:p>
       <w:r>
-        <w:t>Estado:</w:t>
-      </w:r>
-    </w:p>
-    <w:p>
-      <w:r>
-        <w:t>Pendiente</w:t>
-      </w:r>
-      <w:r>
-        <w:br/>
-      </w:r>
-      <w:r>
-        <w:br/>
-        <w:t>Confirmado</w:t>
+        <w:t>Estado inicial:</w:t>
+      </w:r>
+    </w:p>
+    <w:p>
+      <w:r>
+        <w:t>Pendiente. Al confirmar se registra el monto real y se pueden corregir los datos del formulario.</w:t>
       </w:r>
     </w:p>
     <w:p>
@@ -1343,64 +1304,28 @@
     </w:p>
     <w:p>
       <w:r>
-        <w:t>Monto</w:t>
-      </w:r>
-      <w:r>
-        <w:br/>
-      </w:r>
-      <w:r>
+        <w:t>Monto esperado</w:t>
+        <w:br/>
         <w:br/>
         <w:t>Cuenta origen</w:t>
-      </w:r>
-      <w:r>
-        <w:br/>
-      </w:r>
-      <w:r>
+        <w:br/>
         <w:br/>
         <w:t>Categoría</w:t>
-      </w:r>
-      <w:r>
-        <w:br/>
-      </w:r>
-      <w:r>
+        <w:br/>
         <w:br/>
         <w:t>Subcategoría</w:t>
-      </w:r>
-      <w:r>
-        <w:br/>
-      </w:r>
-      <w:r>
+        <w:br/>
         <w:br/>
         <w:t>Fecha</w:t>
-      </w:r>
-      <w:r>
-        <w:br/>
-      </w:r>
-      <w:r>
+        <w:br/>
         <w:br/>
         <w:t>Hora</w:t>
-      </w:r>
-      <w:r>
-        <w:br/>
-      </w:r>
-      <w:r>
-        <w:br/>
-        <w:t>Estado</w:t>
-      </w:r>
-      <w:r>
-        <w:br/>
-      </w:r>
-      <w:r>
-        <w:lastRenderedPageBreak/>
+        <w:br/>
         <w:br/>
         <w:t>Descripción</w:t>
-      </w:r>
-      <w:r>
-        <w:br/>
-      </w:r>
-      <w:r>
-        <w:br/>
-        <w:t>Recurrente</w:t>
+        <w:br/>
+        <w:br/>
+        <w:t>Recurrente (cuando exista el módulo)</w:t>
       </w:r>
     </w:p>
     <w:p>
@@ -1412,7 +1337,7 @@
     </w:p>
     <w:p>
       <w:r>
-        <w:t>Igual que ingresos.</w:t>
+        <w:t>Los egresos también nacen pendientes. La confirmación conserva el monto esperado y registra el monto realmente pagado.</w:t>
       </w:r>
     </w:p>
     <w:p>
@@ -1514,9 +1439,7 @@
     </w:p>
     <w:p>
       <w:r>
-        <w:pict w14:anchorId="6BA85FCA">
-          <v:rect id="_x0000_i1053" style="width:0;height:1.5pt" o:hralign="center" o:hrstd="t" o:hr="t" fillcolor="#a0a0a0" stroked="f"/>
-        </w:pict>
+        <w:t>Una transferencia realizada en el momento puede crearse confirmada. Una transferencia programada queda pendiente hasta que el usuario confirme el monto y los datos reales.</w:t>
       </w:r>
     </w:p>
     <w:p>
@@ -2016,7 +1939,7 @@
     </w:p>
     <w:p>
       <w:r>
-        <w:t>El módulo de categorías será el encargado de organizar todos los ingresos y egresos del sistema, permitiendo clasificar cada movimiento financiero para obtener análisis más claros y ordenados. Existirán dos grandes grupos: categorías de ingresos y categorías de egresos. Cada categoría podrá tener una o varias subcategorías para un nivel de detalle mayor. Por ejemplo, dentro de la categoría "Entretenimiento" podrán existir subcategorías como "Ocio", "Cine", "Eventos" o "Viajes y Vacaciones". Visualmente, el usuario verá las categorías agrupadas en pestañas de ingresos y egresos, donde cada categoría mostrará su nombre, color, icono representativo y el total gastado o recibido durante el mes actual. Este total se calculará únicamente utilizando movimientos confirmados, ignorando los pendientes hasta que cambien de estado. Al iniciar un nuevo mes, el cálculo mensual volverá a empezar desde cero, aunque el historial seguirá disponible para reportes y análisis. Además, el usuario podrá crear, editar, eliminar, importar y exportar categorías, personalizando colores, iconos y subcategorías según sus necesidades.</w:t>
+        <w:t>El módulo de categorías organiza los ingresos y egresos por mes. Existen categorías de ingresos y categorías de egresos; las de egresos pueden contener subcategorías. Cada tarjeta muestra nombre, color, icono y el total real confirmado del periodo. Al preparar un mes nuevo se copian las categorías y subcategorías del último mes anterior; desde ese momento el nuevo mes queda independiente. Editar o eliminar en agosto no modifica julio. Importar y exportar se mantienen como una fase futura.</w:t>
       </w:r>
     </w:p>
     <w:p>
@@ -2208,7 +2131,7 @@
     </w:p>
     <w:p>
       <w:r>
-        <w:t>Cada categoría podrá contener subcategorías.</w:t>
+        <w:t>Las categorías de egresos podrán contener subcategorías administradas desde la categoría padre.</w:t>
       </w:r>
     </w:p>
     <w:p>
@@ -2551,9 +2474,7 @@
     </w:p>
     <w:p>
       <w:r>
-        <w:pict w14:anchorId="1CE7F2B2">
-          <v:rect id="_x0000_i1071" style="width:0;height:1.5pt" o:hralign="center" o:hrstd="t" o:hr="t" fillcolor="#a0a0a0" stroked="f"/>
-        </w:pict>
+        <w:t>Comportamiento mensual: el usuario puede preparar meses futuros. La primera vez que abre un periodo se copia la configuración anterior y luego las modificaciones quedan limitadas a ese mes.</w:t>
       </w:r>
     </w:p>
     <w:p>
@@ -2987,36 +2908,32 @@
         </w:rPr>
       </w:pPr>
       <w:r>
-        <w:rPr>
-          <w:b/>
-          <w:bCs/>
-        </w:rPr>
-        <w:t>Eliminación</w:t>
-      </w:r>
-    </w:p>
-    <w:p>
-      <w:r>
-        <w:t>Al eliminar una categoría:</w:t>
-      </w:r>
-    </w:p>
-    <w:p>
-      <w:r>
-        <w:t>No se eliminan los movimientos históricos.</w:t>
-      </w:r>
-    </w:p>
-    <w:p>
-      <w:r>
-        <w:t>Se recomienda:</w:t>
-      </w:r>
-    </w:p>
-    <w:p>
-      <w:r>
-        <w:t>Desactivar la categoría</w:t>
-      </w:r>
-    </w:p>
-    <w:p>
-      <w:r>
-        <w:t>para conservar la integridad de los registros anteriores.</w:t>
+        <w:t>Eliminación mensual</w:t>
+      </w:r>
+    </w:p>
+    <w:p>
+      <w:r>
+        <w:t>Al eliminar una categoría, solo desaparece del mes al que pertenece.</w:t>
+      </w:r>
+    </w:p>
+    <w:p>
+      <w:r>
+        <w:t>Si tiene movimientos visibles pendientes, confirmados o cancelados, la eliminación se bloquea.</w:t>
+      </w:r>
+    </w:p>
+    <w:p>
+      <w:r>
+        <w:t>El sistema debe indicar cuántos movimientos la utilizan.</w:t>
+      </w:r>
+    </w:p>
+    <w:p>
+      <w:r>
+        <w:t>El usuario debe cambiar esos movimientos a otra categoría o eliminarlos primero.</w:t>
+      </w:r>
+    </w:p>
+    <w:p>
+      <w:r>
+        <w:t>Los meses anteriores conservan su propia categoría e historial.</w:t>
       </w:r>
     </w:p>
     <w:p>
@@ -3034,31 +2951,18 @@
         </w:rPr>
       </w:pPr>
       <w:r>
-        <w:rPr>
-          <w:b/>
-          <w:bCs/>
-        </w:rPr>
-        <w:t>Importación y exportación</w:t>
-      </w:r>
-    </w:p>
-    <w:p>
-      <w:pPr>
-        <w:rPr>
-          <w:b/>
-          <w:bCs/>
-        </w:rPr>
-      </w:pPr>
-      <w:r>
-        <w:rPr>
-          <w:b/>
-          <w:bCs/>
-        </w:rPr>
-        <w:t>Exportar</w:t>
-      </w:r>
-    </w:p>
-    <w:p>
-      <w:r>
-        <w:t>Permite guardar:</w:t>
+        <w:t>Importación y exportación (fase futura)</w:t>
+      </w:r>
+    </w:p>
+    <w:p>
+      <w:pPr>
+        <w:rPr>
+          <w:b/>
+          <w:bCs/>
+        </w:rPr>
+      </w:pPr>
+      <w:r>
+        <w:t>Estas funciones quedan planificadas para una etapa posterior y no forman parte del backend actual.</w:t>
       </w:r>
     </w:p>
     <w:p>
@@ -3080,13 +2984,6 @@
       </w:r>
     </w:p>
     <w:p>
-      <w:r>
-        <w:pict w14:anchorId="78103E8B">
-          <v:rect id="_x0000_i1080" style="width:0;height:1.5pt" o:hralign="center" o:hrstd="t" o:hr="t" fillcolor="#a0a0a0" stroked="f"/>
-        </w:pict>
-      </w:r>
-    </w:p>
-    <w:p>
       <w:pPr>
         <w:rPr>
           <w:b/>
@@ -3103,21 +3000,11 @@
     </w:p>
     <w:p>
       <w:r>
-        <w:t>Permite cargar:</w:t>
-      </w:r>
-    </w:p>
-    <w:p>
-      <w:r>
         <w:t>Configuración completa de categorías</w:t>
       </w:r>
     </w:p>
     <w:p>
       <w:r>
-        <w:t>Ideal para:</w:t>
-      </w:r>
-    </w:p>
-    <w:p>
-      <w:r>
         <w:t>Cambio de dispositivo</w:t>
       </w:r>
       <w:r>
@@ -3130,13 +3017,6 @@
       </w:r>
     </w:p>
     <w:p>
-      <w:r>
-        <w:pict w14:anchorId="223C5A2D">
-          <v:rect id="_x0000_i1081" style="width:0;height:1.5pt" o:hralign="center" o:hrstd="t" o:hr="t" fillcolor="#a0a0a0" stroked="f"/>
-        </w:pict>
-      </w:r>
-    </w:p>
-    <w:p>
       <w:pPr>
         <w:rPr>
           <w:b/>
@@ -3153,11 +3033,6 @@
     </w:p>
     <w:p>
       <w:r>
-        <w:t>Las categorías serán utilizadas por:</w:t>
-      </w:r>
-    </w:p>
-    <w:p>
-      <w:r>
         <w:t>Cuentas</w:t>
       </w:r>
       <w:r>
@@ -3181,16 +3056,22 @@
         <w:t>Dashboard</w:t>
       </w:r>
     </w:p>
-    <w:p>
-      <w:r>
-        <w:t>Por lo tanto, funcionarán como un catálogo central que ayudará a clasificar y analizar toda la actividad financiera del usuario.</w:t>
-      </w:r>
-    </w:p>
     <w:p/>
-    <w:p/>
     <w:p>
       <w:r>
         <w:br w:type="page"/>
+      </w:r>
+    </w:p>
+    <w:p>
+      <w:pPr/>
+      <w:r>
+        <w:t>MODULO INGRESOS FIJOS E INGRESOS CASUALES</w:t>
+      </w:r>
+    </w:p>
+    <w:p>
+      <w:pPr/>
+      <w:r>
+        <w:t>El sistema contara con un modulo de ingresos dividido en dos tipos. Los ingresos fijos representaran cobros que se esperan de forma repetida, como el sueldo. Los ingresos casuales representaran entradas de dinero ocasionales que no se repetiran automaticamente. Ambos crearan movimientos pendientes con un monto esperado; al confirmarlos se guardara el monto realmente recibido sin modificar el valor definido para futuros ingresos fijos.</w:t>
       </w:r>
     </w:p>
     <w:p>

</xml_diff>